<commit_message>
Make s3 dicom path configurable
</commit_message>
<xml_diff>
--- a/docs/SOP_cdniproc_wrapper.docx
+++ b/docs/SOP_cdniproc_wrapper.docx
@@ -506,7 +506,7 @@
         <w:t>SES</w:t>
       </w:r>
       <w:r>
-        <w:t xml:space="preserve"> = session label without "ses-", exactly as in the S3 folder name, two digits (01). </w:t>
+        <w:t xml:space="preserve"> = session label without "ses-", as it appears in the S3 folder name (numeric sessions two digits, e.g. 01; labels such as 3TD1 or 7T1 are fine). </w:t>
       </w:r>
       <w:r>
         <w:rPr>
@@ -515,17 +515,7 @@
         <w:t>MAGNET</w:t>
       </w:r>
       <w:r>
-        <w:t xml:space="preserve"> = 3T or 7T; optional, if you leave it out the DEFAULT_MAGNET from config.sh is used (3T unless you change it), so a study with a single field strength can ignore it. S3 folders must be named </w:t>
-      </w:r>
-      <w:r>
-        <w:rPr>
-          <w:rFonts w:ascii="Consolas" w:hAnsi="Consolas"/>
-          <w:sz w:val="19"/>
-        </w:rPr>
-        <w:t>s3://&lt;bucket&gt;/dicoms/&lt;SUB&gt;_&lt;SES&gt;/</w:t>
-      </w:r>
-      <w:r>
-        <w:t>.</w:t>
+        <w:t xml:space="preserve"> = 3T or 7T; optional, if you leave it out the DEFAULT_MAGNET from config.sh is used (3T unless you change it), so a study with a single field strength can ignore it. Where the DICOMs sit in S3 is set by S3_BUCKET and S3_DICOM_PATH in config.sh.</w:t>
       </w:r>
     </w:p>
     <w:p>
@@ -723,7 +713,7 @@
         <w:t>config.sh</w:t>
       </w:r>
       <w:r>
-        <w:t>, which is divided into numbered sections. config.sh ships with placeholders (YOUR_SLURM_ACCOUNT, YOUR_S3_BUCKET, YOUR_STUDY in OUT_BASE) and run_subject.sh will not run until they are replaced. Other defaults are the settings the original study used.</w:t>
+        <w:t>, which is divided into numbered sections. config.sh ships with placeholders (YOUR_SLURM_ACCOUNT, YOUR_S3_BUCKET) and run_subject.sh will not run until they are replaced. Other defaults are the settings the original study used.</w:t>
       </w:r>
     </w:p>
     <w:tbl>
@@ -912,7 +902,109 @@
               <w:spacing w:after="40"/>
             </w:pPr>
             <w:r>
-              <w:t>Bucket that holds the study DICOMs as dicoms/&lt;SUB&gt;_&lt;SES&gt;/.</w:t>
+              <w:t>Bucket name only (the part right after s3://).</w:t>
+            </w:r>
+          </w:p>
+        </w:tc>
+      </w:tr>
+      <w:tr>
+        <w:tc>
+          <w:tcPr>
+            <w:tcW w:type="dxa" w:w="2448"/>
+          </w:tcPr>
+          <w:p>
+            <w:pPr>
+              <w:spacing w:after="40"/>
+            </w:pPr>
+            <w:r>
+              <w:t>S3_DICOM_PATH</w:t>
+            </w:r>
+          </w:p>
+        </w:tc>
+        <w:tc>
+          <w:tcPr>
+            <w:tcW w:type="dxa" w:w="1152"/>
+          </w:tcPr>
+          <w:p>
+            <w:pPr>
+              <w:spacing w:after="40"/>
+            </w:pPr>
+            <w:r>
+              <w:t>1</w:t>
+            </w:r>
+          </w:p>
+        </w:tc>
+        <w:tc>
+          <w:tcPr>
+            <w:tcW w:type="dxa" w:w="5760"/>
+          </w:tcPr>
+          <w:p>
+            <w:pPr>
+              <w:spacing w:after="40"/>
+            </w:pPr>
+            <w:r>
+              <w:t xml:space="preserve">Where one session's DICOMs are inside the bucket, as a template; {SUB}, {SES} and {MAGNET} are filled in for each run. Default </w:t>
+            </w:r>
+            <w:r>
+              <w:rPr>
+                <w:rFonts w:ascii="Consolas" w:hAnsi="Consolas"/>
+                <w:sz w:val="19"/>
+              </w:rPr>
+              <w:t>dicoms/{SUB}_{SES}/</w:t>
+            </w:r>
+            <w:r>
+              <w:t xml:space="preserve">. For s3://&lt;bucket&gt;/pfm3t7t/3T/dicoms/sub-PFM3T7T01_ses-3TD1/ use </w:t>
+            </w:r>
+            <w:r>
+              <w:rPr>
+                <w:rFonts w:ascii="Consolas" w:hAnsi="Consolas"/>
+                <w:sz w:val="19"/>
+              </w:rPr>
+              <w:t>pfm3t7t/{MAGNET}/dicoms/sub-{SUB}_ses-{SES}/</w:t>
+            </w:r>
+            <w:r>
+              <w:t>. If the first folder is the bucket itself, put it in S3_BUCKET and drop it from the pattern.</w:t>
+            </w:r>
+          </w:p>
+        </w:tc>
+      </w:tr>
+      <w:tr>
+        <w:tc>
+          <w:tcPr>
+            <w:tcW w:type="dxa" w:w="2448"/>
+          </w:tcPr>
+          <w:p>
+            <w:pPr>
+              <w:spacing w:after="40"/>
+            </w:pPr>
+            <w:r>
+              <w:t>STUDY_NAME</w:t>
+            </w:r>
+          </w:p>
+        </w:tc>
+        <w:tc>
+          <w:tcPr>
+            <w:tcW w:type="dxa" w:w="1152"/>
+          </w:tcPr>
+          <w:p>
+            <w:pPr>
+              <w:spacing w:after="40"/>
+            </w:pPr>
+            <w:r>
+              <w:t>1</w:t>
+            </w:r>
+          </w:p>
+        </w:tc>
+        <w:tc>
+          <w:tcPr>
+            <w:tcW w:type="dxa" w:w="5760"/>
+          </w:tcPr>
+          <w:p>
+            <w:pPr>
+              <w:spacing w:after="40"/>
+            </w:pPr>
+            <w:r>
+              <w:t>Optional short study name (e.g. mystudy). It becomes a folder in the default OUT_BASE; leave it empty to skip that folder.</w:t>
             </w:r>
           </w:p>
         </w:tc>
@@ -953,7 +1045,7 @@
               <w:spacing w:after="40"/>
             </w:pPr>
             <w:r>
-              <w:t>Scratch location for all outputs (replace YOUR_STUDY with your study name); everything is written under OUT_BASE/&lt;MAGNET&gt;/. It must NOT contain the words "bids", "sub-" or "ses-" (the lab NORDIC scripts split paths on them). run_subject.sh refuses to start if it does.</w:t>
+              <w:t>Scratch location for all outputs. Default: /scratch.global/&lt;you&gt;/projects/&lt;STUDY_NAME&gt;/data/processing (the STUDY_NAME folder is skipped if empty), or set it to any path; everything is written under OUT_BASE/&lt;MAGNET&gt;/. It (and STUDY_NAME) must NOT contain the words "bids", "sub-" or "ses-" (the lab NORDIC scripts split paths on them). run_subject.sh refuses to start if it does.</w:t>
             </w:r>
           </w:p>
         </w:tc>

</xml_diff>

<commit_message>
Change example var names
</commit_message>
<xml_diff>
--- a/docs/SOP_cdniproc_wrapper.docx
+++ b/docs/SOP_cdniproc_wrapper.docx
@@ -506,7 +506,7 @@
         <w:t>SES</w:t>
       </w:r>
       <w:r>
-        <w:t xml:space="preserve"> = session label without "ses-", as it appears in the S3 folder name (numeric sessions two digits, e.g. 01; labels such as 3TD1 or 7T1 are fine). </w:t>
+        <w:t xml:space="preserve"> = session label without "ses-", as it appears in the S3 folder name (numeric sessions two digits, e.g. 01; labels such as 3T1 or 7T1 are fine). </w:t>
       </w:r>
       <w:r>
         <w:rPr>
@@ -953,14 +953,14 @@
               <w:t>dicoms/{SUB}_{SES}/</w:t>
             </w:r>
             <w:r>
-              <w:t xml:space="preserve">. For s3://&lt;bucket&gt;/pfm3t7t/3T/dicoms/sub-PFM3T7T01_ses-3TD1/ use </w:t>
+              <w:t xml:space="preserve">. For s3://&lt;bucket&gt;/mystudy/3T/dicoms/sub-SUB001_ses-3T1/ use </w:t>
             </w:r>
             <w:r>
               <w:rPr>
                 <w:rFonts w:ascii="Consolas" w:hAnsi="Consolas"/>
                 <w:sz w:val="19"/>
               </w:rPr>
-              <w:t>pfm3t7t/{MAGNET}/dicoms/sub-{SUB}_ses-{SES}/</w:t>
+              <w:t>mystudy/{MAGNET}/dicoms/sub-{SUB}_ses-{SES}/</w:t>
             </w:r>
             <w:r>
               <w:t>. If the first folder is the bucket itself, put it in S3_BUCKET and drop it from the pattern.</w:t>

</xml_diff>

<commit_message>
Changed --use-view flag to --use-txt
</commit_message>
<xml_diff>
--- a/docs/SOP_cdniproc_wrapper.docx
+++ b/docs/SOP_cdniproc_wrapper.docx
@@ -2028,7 +2028,7 @@
           <w:rFonts w:ascii="Consolas" w:hAnsi="Consolas"/>
           <w:sz w:val="19"/>
         </w:rPr>
-        <w:t>--use-view</w:t>
+        <w:t>--use-txt</w:t>
       </w:r>
       <w:r>
         <w:t xml:space="preserve"> (</w:t>
@@ -2038,7 +2038,7 @@
           <w:rFonts w:ascii="Consolas" w:hAnsi="Consolas"/>
           <w:sz w:val="19"/>
         </w:rPr>
-        <w:t>./run_subject.sh SUB [MAGNET] SES --from 2 --use-view</w:t>
+        <w:t>./run_subject.sh SUB [MAGNET] SES --from 2 --use-txt</w:t>
       </w:r>
       <w:r>
         <w:t>).</w:t>
@@ -2050,7 +2050,7 @@
         <w:spacing w:after="40"/>
       </w:pPr>
       <w:r>
-        <w:t>The TSV stays the source of truth. --use-view writes only the cells you changed in the text file (compared with a hidden snapshot taken when the view was made); anything changed in the TSV by hand is kept. If the same cell was changed differently in both, nothing is written and the conflict is listed.</w:t>
+        <w:t>The TSV stays the source of truth. --use-txt writes only the cells you changed in the text file (compared with a hidden snapshot taken when the view was made); anything changed in the TSV by hand is kept. If the same cell was changed differently in both, nothing is written and the conflict is listed.</w:t>
       </w:r>
     </w:p>
     <w:p>
@@ -2059,7 +2059,7 @@
         <w:spacing w:after="40"/>
       </w:pPr>
       <w:r>
-        <w:t>Without --use-view step 02 uses the TSV as before. If the text file holds edits that are not in the TSV, step 02 stops and says so, so edits are never silently ignored.</w:t>
+        <w:t>Without --use-txt step 02 uses the TSV as before. If the text file holds edits that are not in the TSV, step 02 stops and says so, so edits are never silently ignored.</w:t>
       </w:r>
     </w:p>
     <w:p>

</xml_diff>

<commit_message>
made usemagnet folder optional
</commit_message>
<xml_diff>
--- a/docs/SOP_cdniproc_wrapper.docx
+++ b/docs/SOP_cdniproc_wrapper.docx
@@ -978,6 +978,47 @@
               <w:spacing w:after="40"/>
             </w:pPr>
             <w:r>
+              <w:t>USE_MAGNET_FOLDER</w:t>
+            </w:r>
+          </w:p>
+        </w:tc>
+        <w:tc>
+          <w:tcPr>
+            <w:tcW w:type="dxa" w:w="1152"/>
+          </w:tcPr>
+          <w:p>
+            <w:pPr>
+              <w:spacing w:after="40"/>
+            </w:pPr>
+            <w:r>
+              <w:t>1</w:t>
+            </w:r>
+          </w:p>
+        </w:tc>
+        <w:tc>
+          <w:tcPr>
+            <w:tcW w:type="dxa" w:w="5760"/>
+          </w:tcPr>
+          <w:p>
+            <w:pPr>
+              <w:spacing w:after="40"/>
+            </w:pPr>
+            <w:r>
+              <w:t>0 (default): outputs go straight in OUT_BASE (e.g. .../processing/bids/). 1: outputs go in OUT_BASE/&lt;MAGNET&gt;/ (e.g. .../processing/3T/bids/); use 1 for a study with both 3T and 7T data so the two do not mix. If you run on an existing folder that already has 3T/bids, set 1; a warning is printed if the setting does not match.</w:t>
+            </w:r>
+          </w:p>
+        </w:tc>
+      </w:tr>
+      <w:tr>
+        <w:tc>
+          <w:tcPr>
+            <w:tcW w:type="dxa" w:w="2448"/>
+          </w:tcPr>
+          <w:p>
+            <w:pPr>
+              <w:spacing w:after="40"/>
+            </w:pPr>
+            <w:r>
               <w:t>STUDY_NAME</w:t>
             </w:r>
           </w:p>
@@ -1045,7 +1086,7 @@
               <w:spacing w:after="40"/>
             </w:pPr>
             <w:r>
-              <w:t>Scratch location for all outputs. Default: /scratch.global/&lt;you&gt;/projects/&lt;STUDY_NAME&gt;/data/processing (the STUDY_NAME folder is skipped if empty), or set it to any path; everything is written under OUT_BASE/&lt;MAGNET&gt;/. It (and STUDY_NAME) must NOT contain the words "bids", "sub-" or "ses-" (the lab NORDIC scripts split paths on them). run_subject.sh refuses to start if it does.</w:t>
+              <w:t>Scratch location for all outputs. Default: /scratch.global/&lt;you&gt;/projects/&lt;STUDY_NAME&gt;/data/processing (the STUDY_NAME folder is skipped if empty), or set it to any path; everything is written directly under OUT_BASE (or OUT_BASE/&lt;MAGNET&gt;/ if USE_MAGNET_FOLDER=1). It (and STUDY_NAME) must NOT contain the words "bids", "sub-" or "ses-" (the lab NORDIC scripts split paths on them). run_subject.sh refuses to start if it does.</w:t>
             </w:r>
           </w:p>
         </w:tc>
@@ -1987,7 +2028,20 @@
           <w:rFonts w:ascii="Consolas" w:hAnsi="Consolas"/>
           <w:sz w:val="19"/>
         </w:rPr>
-        <w:t>OUT_BASE/&lt;MAGNET&gt;/summaries/sub-&lt;SUB&gt;_ses-&lt;SES&gt;.tsv</w:t>
+        <w:t>OUT_BASE/summaries/sub-&lt;SUB&gt;_ses-&lt;SES&gt;.tsv</w:t>
+      </w:r>
+      <w:r>
+        <w:t xml:space="preserve"> (</w:t>
+      </w:r>
+      <w:r>
+        <w:rPr>
+          <w:rFonts w:ascii="Consolas" w:hAnsi="Consolas"/>
+          <w:sz w:val="19"/>
+        </w:rPr>
+        <w:t>OUT_BASE/&lt;MAGNET&gt;/summaries/…</w:t>
+      </w:r>
+      <w:r>
+        <w:t xml:space="preserve"> if USE_MAGNET_FOLDER=1)</w:t>
       </w:r>
     </w:p>
     <w:p>
@@ -2307,7 +2361,7 @@
         <w:t>submits</w:t>
       </w:r>
       <w:r>
-        <w:t xml:space="preserve"> the NORDIC jobs and does not wait. Job IDs are saved in jobs/sub-X_ses-Y.jobids and step 04 waits for them. The command list is saved as summaries/nordic_cmd_*.sh. NORDIC errors are in OUT_BASE/&lt;MAGNET&gt;/logs/nordic/*.err.</w:t>
+        <w:t xml:space="preserve"> the NORDIC jobs and does not wait. Job IDs are saved in jobs/sub-X_ses-Y.jobids and step 04 waits for them. The command list is saved as summaries/nordic_cmd_*.sh. NORDIC errors are in OUT_BASE/logs/nordic/*.err (OUT_BASE/&lt;MAGNET&gt;/logs/nordic/ if USE_MAGNET_FOLDER=1).</w:t>
       </w:r>
     </w:p>
     <w:p>
@@ -2576,7 +2630,20 @@
           <w:rFonts w:ascii="Consolas" w:hAnsi="Consolas"/>
           <w:sz w:val="19"/>
         </w:rPr>
+        <w:t>OUT_BASE/</w:t>
+      </w:r>
+      <w:r>
+        <w:t xml:space="preserve"> (or under </w:t>
+      </w:r>
+      <w:r>
+        <w:rPr>
+          <w:rFonts w:ascii="Consolas" w:hAnsi="Consolas"/>
+          <w:sz w:val="19"/>
+        </w:rPr>
         <w:t>OUT_BASE/&lt;MAGNET&gt;/</w:t>
+      </w:r>
+      <w:r>
+        <w:t xml:space="preserve"> if USE_MAGNET_FOLDER=1)</w:t>
       </w:r>
     </w:p>
     <w:tbl>
@@ -3035,7 +3102,7 @@
         <w:spacing w:after="100"/>
       </w:pPr>
       <w:r>
-        <w:t>MAGNET only matters for studies that have both 3T and 7T data. Studies with one field strength can leave it out of every command and set DEFAULT_MAGNET in config.sh (3T by default). With both, give it explicitly. It also names the output sub-folder: OUT_BASE/3T/ or OUT_BASE/7T/.</w:t>
+        <w:t>MAGNET only matters for studies that have both 3T and 7T data. Studies with one field strength can leave it out of every command and set DEFAULT_MAGNET in config.sh (3T by default). With both, give it explicitly. If you set USE_MAGNET_FOLDER=1 in config.sh it also names the output sub-folder (OUT_BASE/3T/ or OUT_BASE/7T/), which keeps the two field strengths apart. The default is no such folder.</w:t>
       </w:r>
     </w:p>
     <w:p>
@@ -3686,6 +3753,50 @@
     </w:p>
     <w:p>
       <w:pPr>
+        <w:pStyle w:val="Heading2"/>
+      </w:pPr>
+      <w:r>
+        <w:t>Using it on an existing study folder (for example only steps 4 and 5)</w:t>
+      </w:r>
+    </w:p>
+    <w:p>
+      <w:pPr>
+        <w:spacing w:after="0"/>
+        <w:ind w:left="216"/>
+        <w:shd w:val="clear" w:fill="F2F2F2"/>
+      </w:pPr>
+      <w:r>
+        <w:rPr>
+          <w:rFonts w:ascii="Consolas" w:hAnsi="Consolas"/>
+          <w:sz w:val="19"/>
+        </w:rPr>
+        <w:t>export OUT_BASE="/path/to/study"      # the folder that CONTAINS bids/, e.g. /path/to/study/bids/sub-X/ses-Y/func</w:t>
+      </w:r>
+    </w:p>
+    <w:p>
+      <w:pPr>
+        <w:spacing w:after="120"/>
+        <w:ind w:left="216"/>
+        <w:shd w:val="clear" w:fill="F2F2F2"/>
+      </w:pPr>
+      <w:r>
+        <w:rPr>
+          <w:rFonts w:ascii="Consolas" w:hAnsi="Consolas"/>
+          <w:sz w:val="19"/>
+        </w:rPr>
+        <w:t>./run_subject.sh SUB001 01 --from 4 --to 5</w:t>
+      </w:r>
+    </w:p>
+    <w:p>
+      <w:pPr>
+        <w:spacing w:after="100"/>
+      </w:pPr>
+      <w:r>
+        <w:t>(Set OUT_BASE in config.sh rather than exporting it if you will run more than once. USE_MAGNET_FOLDER stays at its default 0, so there is no 3T/ or 7T/ folder inside.) The wrapper adds summaries/, jobs/, logs/, bids_combined/, bids_sessions/ and derivatives/nordic/ inside that folder. Step 4 expects bids/sub-X/ses-Y/{func,fmap,anat} with the NORDIC output files next to the originals; if your NORDIC output already lives in derivatives/nordic/, check the postnordic.py part of step 4 first.</w:t>
+      </w:r>
+    </w:p>
+    <w:p>
+      <w:pPr>
         <w:pStyle w:val="Heading1"/>
       </w:pPr>
       <w:r>

</xml_diff>

<commit_message>
ses combined behavior and flags
</commit_message>
<xml_diff>
--- a/docs/SOP_cdniproc_wrapper.docx
+++ b/docs/SOP_cdniproc_wrapper.docx
@@ -1326,6 +1326,47 @@
               <w:spacing w:after="40"/>
             </w:pPr>
             <w:r>
+              <w:t>DERIV_BASE, WORK_BASE</w:t>
+            </w:r>
+          </w:p>
+        </w:tc>
+        <w:tc>
+          <w:tcPr>
+            <w:tcW w:type="dxa" w:w="1152"/>
+          </w:tcPr>
+          <w:p>
+            <w:pPr>
+              <w:spacing w:after="40"/>
+            </w:pPr>
+            <w:r>
+              <w:t>5</w:t>
+            </w:r>
+          </w:p>
+        </w:tc>
+        <w:tc>
+          <w:tcPr>
+            <w:tcW w:type="dxa" w:w="5760"/>
+          </w:tcPr>
+          <w:p>
+            <w:pPr>
+              <w:spacing w:after="40"/>
+            </w:pPr>
+            <w:r>
+              <w:t>Optional. Where step 05 writes the fMRIPrep / XCP-D results (DERIV_BASE) and their huge work folders (WORK_BASE). Empty = OUT_BASE/derivatives. If the data live on /projects with a small quota, keep OUT_BASE there and set WORK_BASE to a scratch path.</w:t>
+            </w:r>
+          </w:p>
+        </w:tc>
+      </w:tr>
+      <w:tr>
+        <w:tc>
+          <w:tcPr>
+            <w:tcW w:type="dxa" w:w="2448"/>
+          </w:tcPr>
+          <w:p>
+            <w:pPr>
+              <w:spacing w:after="40"/>
+            </w:pPr>
+            <w:r>
               <w:t>FMRIPREP_FLAGS, XCPD_FLAGS</w:t>
             </w:r>
           </w:p>
@@ -1394,6 +1435,47 @@
             </w:pPr>
             <w:r>
               <w:t>jsbr (our script, shim + timing aware) or lab (IntendedFor_new.py, shim matching). Keep jsbr unless you have a reason.</w:t>
+            </w:r>
+          </w:p>
+        </w:tc>
+      </w:tr>
+      <w:tr>
+        <w:tc>
+          <w:tcPr>
+            <w:tcW w:type="dxa" w:w="2448"/>
+          </w:tcPr>
+          <w:p>
+            <w:pPr>
+              <w:spacing w:after="40"/>
+            </w:pPr>
+            <w:r>
+              <w:t>SKIP_LAYOUTS_FOR_ONE_SESSION</w:t>
+            </w:r>
+          </w:p>
+        </w:tc>
+        <w:tc>
+          <w:tcPr>
+            <w:tcW w:type="dxa" w:w="1152"/>
+          </w:tcPr>
+          <w:p>
+            <w:pPr>
+              <w:spacing w:after="40"/>
+            </w:pPr>
+            <w:r>
+              <w:t>7</w:t>
+            </w:r>
+          </w:p>
+        </w:tc>
+        <w:tc>
+          <w:tcPr>
+            <w:tcW w:type="dxa" w:w="5760"/>
+          </w:tcPr>
+          <w:p>
+            <w:pPr>
+              <w:spacing w:after="40"/>
+            </w:pPr>
+            <w:r>
+              <w:t>1 (default): a subject with one session skips bids_combined / bids_sessions and fMRIPrep reads derivatives/nordic. 0: always build both.</w:t>
             </w:r>
           </w:p>
         </w:tc>
@@ -1831,10 +1913,10 @@
           <w:rFonts w:ascii="Consolas" w:hAnsi="Consolas"/>
           <w:sz w:val="19"/>
         </w:rPr>
-        <w:t>--layout combined|sessions</w:t>
+        <w:t>--layout auto|nordic|combined|sessions</w:t>
       </w:r>
       <w:r>
-        <w:t xml:space="preserve"> chooses the fMRIPrep input (default combined). Watch jobs with </w:t>
+        <w:t xml:space="preserve"> chooses the fMRIPrep input (default auto: bids_combined for several sessions, derivatives/nordic for one; see section 5.4). Watch jobs with </w:t>
       </w:r>
       <w:r>
         <w:rPr>
@@ -2421,6 +2503,30 @@
       </w:pPr>
       <w:r>
         <w:rPr>
+          <w:b/>
+        </w:rPr>
+        <w:t>One session:</w:t>
+      </w:r>
+      <w:r>
+        <w:t xml:space="preserve"> there is nothing to combine, so the next two bullets are skipped. IntendedFor is written straight into derivatives/nordic/sub-X/ses-Y/ and step 5 reads derivatives/nordic with the real session name kept (as in the lab workflow). Set SKIP_LAYOUTS_FOR_ONE_SESSION=0 in config.sh to always build both.</w:t>
+      </w:r>
+    </w:p>
+    <w:p>
+      <w:pPr>
+        <w:pStyle w:val="ListBullet"/>
+        <w:spacing w:after="40"/>
+      </w:pPr>
+      <w:r>
+        <w:rPr>
+          <w:b/>
+        </w:rPr>
+        <w:t>Several sessions:</w:t>
+      </w:r>
+      <w:r>
+        <w:t xml:space="preserve"> </w:t>
+      </w:r>
+      <w:r>
+        <w:rPr>
           <w:rFonts w:ascii="Consolas" w:hAnsi="Consolas"/>
           <w:sz w:val="19"/>
         </w:rPr>
@@ -2566,7 +2672,7 @@
         <w:spacing w:after="40"/>
       </w:pPr>
       <w:r>
-        <w:t>Runs fMRIPrep (singularity container) on bids_combined, then XCP-D in abcd mode with the lab's standard filter settings.</w:t>
+        <w:t>Runs fMRIPrep (singularity container) on bids_combined (several sessions) or derivatives/nordic (one session; --layout auto picks), then XCP-D in abcd mode with the lab's standard filter settings.</w:t>
       </w:r>
     </w:p>
     <w:p>
@@ -2955,7 +3061,7 @@
               <w:spacing w:after="40"/>
             </w:pPr>
             <w:r>
-              <w:t>fMRIPrep input.</w:t>
+              <w:t>fMRIPrep input for subjects with several sessions (not made for a single session).</w:t>
             </w:r>
           </w:p>
         </w:tc>

</xml_diff>